<commit_message>
Update Experiment 1 files
</commit_message>
<xml_diff>
--- a/Experiment-01-FTK-Imager-Evidence-Acquisition/Exp_1.docx
+++ b/Experiment-01-FTK-Imager-Evidence-Acquisition/Exp_1.docx
@@ -333,7 +333,31 @@
         <w:rPr>
           <w:rFonts w:ascii="Times New Roman" w:hAnsi="Times New Roman" w:cs="Times New Roman"/>
         </w:rPr>
-        <w:t xml:space="preserve"> Evidence PC/Workstation, Target Storage Drive (hp v221w 16GB USB Device).</w:t>
+        <w:t xml:space="preserve"> Evidence PC/Workstation, Target Storage Drive (</w:t>
+      </w:r>
+      <w:r>
+        <w:rPr>
+          <w:rFonts w:ascii="Times New Roman" w:hAnsi="Times New Roman" w:cs="Times New Roman"/>
+        </w:rPr>
+        <w:t>USB Flash Disk</w:t>
+      </w:r>
+      <w:r>
+        <w:rPr>
+          <w:rFonts w:ascii="Times New Roman" w:hAnsi="Times New Roman" w:cs="Times New Roman"/>
+        </w:rPr>
+        <w:t xml:space="preserve"> </w:t>
+      </w:r>
+      <w:r>
+        <w:rPr>
+          <w:rFonts w:ascii="Times New Roman" w:hAnsi="Times New Roman" w:cs="Times New Roman"/>
+        </w:rPr>
+        <w:t>31</w:t>
+      </w:r>
+      <w:r>
+        <w:rPr>
+          <w:rFonts w:ascii="Times New Roman" w:hAnsi="Times New Roman" w:cs="Times New Roman"/>
+        </w:rPr>
+        <w:t>GB USB Device).</w:t>
       </w:r>
     </w:p>
     <w:p>
@@ -2682,9 +2706,9 @@
           <w:noProof/>
         </w:rPr>
         <w:drawing>
-          <wp:inline distT="0" distB="0" distL="0" distR="0" wp14:anchorId="77A1FF07" wp14:editId="67F36416">
-            <wp:extent cx="5731510" cy="2950845"/>
-            <wp:effectExtent l="0" t="0" r="2540" b="1905"/>
+          <wp:inline distT="0" distB="0" distL="0" distR="0" wp14:anchorId="77A1FF07" wp14:editId="595CAA5C">
+            <wp:extent cx="5346192" cy="2749550"/>
+            <wp:effectExtent l="0" t="0" r="6985" b="0"/>
             <wp:docPr id="1882990779" name="Picture 15"/>
             <wp:cNvGraphicFramePr>
               <a:graphicFrameLocks xmlns:a="http://schemas.openxmlformats.org/drawingml/2006/main" noChangeAspect="1"/>
@@ -2693,20 +2717,20 @@
               <a:graphicData uri="http://schemas.openxmlformats.org/drawingml/2006/picture">
                 <pic:pic xmlns:pic="http://schemas.openxmlformats.org/drawingml/2006/picture">
                   <pic:nvPicPr>
-                    <pic:cNvPr id="0" name="Picture 32"/>
+                    <pic:cNvPr id="1882990779" name="Picture 15"/>
                     <pic:cNvPicPr>
                       <a:picLocks noChangeAspect="1" noChangeArrowheads="1"/>
                     </pic:cNvPicPr>
                   </pic:nvPicPr>
-                  <pic:blipFill>
-                    <a:blip r:embed="rId19" cstate="print">
+                  <pic:blipFill rotWithShape="1">
+                    <a:blip r:embed="rId19">
                       <a:extLst>
                         <a:ext uri="{28A0092B-C50C-407E-A947-70E740481C1C}">
                           <a14:useLocalDpi xmlns:a14="http://schemas.microsoft.com/office/drawing/2010/main" val="0"/>
                         </a:ext>
                       </a:extLst>
                     </a:blip>
-                    <a:srcRect/>
+                    <a:srcRect t="6817" r="6668"/>
                     <a:stretch>
                       <a:fillRect/>
                     </a:stretch>
@@ -2714,7 +2738,7 @@
                   <pic:spPr bwMode="auto">
                     <a:xfrm>
                       <a:off x="0" y="0"/>
-                      <a:ext cx="5731510" cy="2950845"/>
+                      <a:ext cx="5346435" cy="2749675"/>
                     </a:xfrm>
                     <a:prstGeom prst="rect">
                       <a:avLst/>
@@ -2723,6 +2747,11 @@
                     <a:ln>
                       <a:noFill/>
                     </a:ln>
+                    <a:extLst>
+                      <a:ext uri="{53640926-AAD7-44D8-BBD7-CCE9431645EC}">
+                        <a14:shadowObscured xmlns:a14="http://schemas.microsoft.com/office/drawing/2010/main"/>
+                      </a:ext>
+                    </a:extLst>
                   </pic:spPr>
                 </pic:pic>
               </a:graphicData>
@@ -2745,92 +2774,100 @@
           <w:i/>
           <w:iCs/>
         </w:rPr>
-        <w:t>Inba.raw</w:t>
-      </w:r>
-      <w:proofErr w:type="spellEnd"/>
+        <w:t>ajvad</w:t>
+      </w:r>
       <w:r>
         <w:rPr>
           <w:rFonts w:ascii="Times New Roman" w:hAnsi="Times New Roman" w:cs="Times New Roman"/>
           <w:i/>
           <w:iCs/>
         </w:rPr>
-        <w:t xml:space="preserve"> memory dump file</w:t>
-      </w:r>
-    </w:p>
-    <w:p>
-      <w:pPr>
-        <w:spacing w:line="360" w:lineRule="auto"/>
-        <w:jc w:val="both"/>
-        <w:rPr>
-          <w:rFonts w:ascii="Times New Roman" w:hAnsi="Times New Roman" w:cs="Times New Roman"/>
-          <w:b/>
-          <w:bCs/>
-        </w:rPr>
-      </w:pPr>
-      <w:r>
-        <w:rPr>
-          <w:rFonts w:ascii="Times New Roman" w:hAnsi="Times New Roman" w:cs="Times New Roman"/>
-          <w:b/>
-          <w:bCs/>
-        </w:rPr>
-        <w:t>Part C: Volatile Memory Analysis using Volatility CLI / Workbench</w:t>
-      </w:r>
-    </w:p>
-    <w:p>
-      <w:pPr>
-        <w:spacing w:line="360" w:lineRule="auto"/>
-        <w:jc w:val="both"/>
-        <w:rPr>
-          <w:rFonts w:ascii="Times New Roman" w:hAnsi="Times New Roman" w:cs="Times New Roman"/>
-        </w:rPr>
-      </w:pPr>
-      <w:r>
-        <w:rPr>
-          <w:rFonts w:ascii="Times New Roman" w:hAnsi="Times New Roman" w:cs="Times New Roman"/>
-          <w:b/>
-          <w:bCs/>
-        </w:rPr>
-        <w:t>Step 1: Launch Volatility Environment</w:t>
-      </w:r>
-    </w:p>
-    <w:p>
-      <w:pPr>
-        <w:spacing w:line="360" w:lineRule="auto"/>
-        <w:jc w:val="both"/>
-        <w:rPr>
-          <w:rFonts w:ascii="Times New Roman" w:hAnsi="Times New Roman" w:cs="Times New Roman"/>
-        </w:rPr>
-      </w:pPr>
-      <w:r>
-        <w:rPr>
-          <w:rFonts w:ascii="Times New Roman" w:hAnsi="Times New Roman" w:cs="Times New Roman"/>
-        </w:rPr>
-        <w:t xml:space="preserve">Open </w:t>
-      </w:r>
-      <w:proofErr w:type="spellStart"/>
-      <w:r>
-        <w:rPr>
-          <w:rFonts w:ascii="Times New Roman" w:hAnsi="Times New Roman" w:cs="Times New Roman"/>
-        </w:rPr>
-        <w:t>PassMark</w:t>
+        <w:t>.raw</w:t>
       </w:r>
       <w:proofErr w:type="spellEnd"/>
       <w:r>
-        <w:rPr>
-          <w:rFonts w:ascii="Times New Roman" w:hAnsi="Times New Roman" w:cs="Times New Roman"/>
-        </w:rPr>
-        <w:t xml:space="preserve"> Volatility Workbench (which acts as a GUI frontend for vol.exe).</w:t>
-      </w:r>
-    </w:p>
-    <w:p>
-      <w:pPr>
-        <w:spacing w:line="360" w:lineRule="auto"/>
-        <w:jc w:val="center"/>
         <w:rPr>
           <w:rFonts w:ascii="Times New Roman" w:hAnsi="Times New Roman" w:cs="Times New Roman"/>
           <w:i/>
           <w:iCs/>
         </w:rPr>
+        <w:t xml:space="preserve"> memory dump file</w:t>
+      </w:r>
+    </w:p>
+    <w:p>
+      <w:pPr>
+        <w:spacing w:line="360" w:lineRule="auto"/>
+        <w:jc w:val="both"/>
+        <w:rPr>
+          <w:rFonts w:ascii="Times New Roman" w:hAnsi="Times New Roman" w:cs="Times New Roman"/>
+          <w:b/>
+          <w:bCs/>
+        </w:rPr>
+      </w:pPr>
+      <w:r>
+        <w:rPr>
+          <w:rFonts w:ascii="Times New Roman" w:hAnsi="Times New Roman" w:cs="Times New Roman"/>
+          <w:b/>
+          <w:bCs/>
+        </w:rPr>
+        <w:t>Part C: Volatile Memory Analysis using Volatility CLI / Workbench</w:t>
+      </w:r>
+    </w:p>
+    <w:p>
+      <w:pPr>
+        <w:spacing w:line="360" w:lineRule="auto"/>
+        <w:jc w:val="both"/>
+        <w:rPr>
+          <w:rFonts w:ascii="Times New Roman" w:hAnsi="Times New Roman" w:cs="Times New Roman"/>
+        </w:rPr>
+      </w:pPr>
+      <w:r>
+        <w:rPr>
+          <w:rFonts w:ascii="Times New Roman" w:hAnsi="Times New Roman" w:cs="Times New Roman"/>
+          <w:b/>
+          <w:bCs/>
+        </w:rPr>
+        <w:t>Step 1: Launch Volatility Environment</w:t>
+      </w:r>
+    </w:p>
+    <w:p>
+      <w:pPr>
+        <w:spacing w:line="360" w:lineRule="auto"/>
+        <w:jc w:val="both"/>
+        <w:rPr>
+          <w:rFonts w:ascii="Times New Roman" w:hAnsi="Times New Roman" w:cs="Times New Roman"/>
+        </w:rPr>
+      </w:pPr>
+      <w:r>
+        <w:rPr>
+          <w:rFonts w:ascii="Times New Roman" w:hAnsi="Times New Roman" w:cs="Times New Roman"/>
+        </w:rPr>
+        <w:t xml:space="preserve">Open </w:t>
+      </w:r>
+      <w:proofErr w:type="spellStart"/>
+      <w:r>
+        <w:rPr>
+          <w:rFonts w:ascii="Times New Roman" w:hAnsi="Times New Roman" w:cs="Times New Roman"/>
+        </w:rPr>
+        <w:t>PassMark</w:t>
+      </w:r>
+      <w:proofErr w:type="spellEnd"/>
+      <w:r>
+        <w:rPr>
+          <w:rFonts w:ascii="Times New Roman" w:hAnsi="Times New Roman" w:cs="Times New Roman"/>
+        </w:rPr>
+        <w:t xml:space="preserve"> Volatility Workbench (which acts as a GUI frontend for vol.exe).</w:t>
+      </w:r>
+    </w:p>
+    <w:p>
+      <w:pPr>
+        <w:spacing w:line="360" w:lineRule="auto"/>
+        <w:jc w:val="center"/>
+        <w:rPr>
+          <w:rFonts w:ascii="Times New Roman" w:hAnsi="Times New Roman" w:cs="Times New Roman"/>
+          <w:i/>
+          <w:iCs/>
+        </w:rPr>
       </w:pPr>
       <w:r>
         <w:rPr>
@@ -2838,7 +2875,7 @@
         </w:rPr>
         <w:lastRenderedPageBreak/>
         <w:drawing>
-          <wp:inline distT="0" distB="0" distL="0" distR="0" wp14:anchorId="0E220FC6" wp14:editId="13F946E2">
+          <wp:inline distT="0" distB="0" distL="0" distR="0" wp14:anchorId="0E220FC6" wp14:editId="0A9C7819">
             <wp:extent cx="5731510" cy="3662680"/>
             <wp:effectExtent l="0" t="0" r="2540" b="0"/>
             <wp:docPr id="1202984294" name="Picture 17"/>
@@ -3164,9 +3201,9 @@
         </w:rPr>
         <w:lastRenderedPageBreak/>
         <w:drawing>
-          <wp:inline distT="0" distB="0" distL="0" distR="0" wp14:anchorId="5998F6E2" wp14:editId="736565A4">
-            <wp:extent cx="5731510" cy="3676650"/>
-            <wp:effectExtent l="0" t="0" r="2540" b="0"/>
+          <wp:inline distT="0" distB="0" distL="0" distR="0" wp14:anchorId="5998F6E2" wp14:editId="00CF4923">
+            <wp:extent cx="5433963" cy="3676650"/>
+            <wp:effectExtent l="0" t="0" r="0" b="0"/>
             <wp:docPr id="371387810" name="Picture 18"/>
             <wp:cNvGraphicFramePr>
               <a:graphicFrameLocks xmlns:a="http://schemas.openxmlformats.org/drawingml/2006/main" noChangeAspect="1"/>
@@ -3175,20 +3212,19 @@
               <a:graphicData uri="http://schemas.openxmlformats.org/drawingml/2006/picture">
                 <pic:pic xmlns:pic="http://schemas.openxmlformats.org/drawingml/2006/picture">
                   <pic:nvPicPr>
-                    <pic:cNvPr id="0" name="Picture 41"/>
+                    <pic:cNvPr id="371387810" name="Picture 18"/>
                     <pic:cNvPicPr>
                       <a:picLocks noChangeAspect="1" noChangeArrowheads="1"/>
                     </pic:cNvPicPr>
                   </pic:nvPicPr>
                   <pic:blipFill>
-                    <a:blip r:embed="rId21" cstate="print">
+                    <a:blip r:embed="rId21">
                       <a:extLst>
                         <a:ext uri="{28A0092B-C50C-407E-A947-70E740481C1C}">
                           <a14:useLocalDpi xmlns:a14="http://schemas.microsoft.com/office/drawing/2010/main" val="0"/>
                         </a:ext>
                       </a:extLst>
                     </a:blip>
-                    <a:srcRect/>
                     <a:stretch>
                       <a:fillRect/>
                     </a:stretch>
@@ -3196,7 +3232,7 @@
                   <pic:spPr bwMode="auto">
                     <a:xfrm>
                       <a:off x="0" y="0"/>
-                      <a:ext cx="5731510" cy="3676650"/>
+                      <a:ext cx="5433963" cy="3676650"/>
                     </a:xfrm>
                     <a:prstGeom prst="rect">
                       <a:avLst/>
@@ -3277,7 +3313,15 @@
           <w:i/>
           <w:iCs/>
         </w:rPr>
-        <w:t>Inba.raw</w:t>
+        <w:t>ajvad</w:t>
+      </w:r>
+      <w:r>
+        <w:rPr>
+          <w:rFonts w:ascii="Times New Roman" w:hAnsi="Times New Roman" w:cs="Times New Roman"/>
+          <w:i/>
+          <w:iCs/>
+        </w:rPr>
+        <w:t>.raw</w:t>
       </w:r>
       <w:proofErr w:type="spellEnd"/>
       <w:r>
@@ -3519,9 +3563,9 @@
         </w:rPr>
         <w:lastRenderedPageBreak/>
         <w:drawing>
-          <wp:inline distT="0" distB="0" distL="0" distR="0" wp14:anchorId="761F141B" wp14:editId="3D15CB43">
-            <wp:extent cx="5731510" cy="2362835"/>
-            <wp:effectExtent l="0" t="0" r="2540" b="0"/>
+          <wp:inline distT="0" distB="0" distL="0" distR="0" wp14:anchorId="761F141B" wp14:editId="236A9483">
+            <wp:extent cx="5700896" cy="2362835"/>
+            <wp:effectExtent l="0" t="0" r="0" b="0"/>
             <wp:docPr id="2057743233" name="Picture 19"/>
             <wp:cNvGraphicFramePr>
               <a:graphicFrameLocks xmlns:a="http://schemas.openxmlformats.org/drawingml/2006/main" noChangeAspect="1"/>
@@ -3530,7 +3574,7 @@
               <a:graphicData uri="http://schemas.openxmlformats.org/drawingml/2006/picture">
                 <pic:pic xmlns:pic="http://schemas.openxmlformats.org/drawingml/2006/picture">
                   <pic:nvPicPr>
-                    <pic:cNvPr id="0" name="Picture 43"/>
+                    <pic:cNvPr id="2057743233" name="Picture 19"/>
                     <pic:cNvPicPr>
                       <a:picLocks noChangeAspect="1" noChangeArrowheads="1"/>
                     </pic:cNvPicPr>
@@ -3543,7 +3587,6 @@
                         </a:ext>
                       </a:extLst>
                     </a:blip>
-                    <a:srcRect/>
                     <a:stretch>
                       <a:fillRect/>
                     </a:stretch>
@@ -3551,7 +3594,7 @@
                   <pic:spPr bwMode="auto">
                     <a:xfrm>
                       <a:off x="0" y="0"/>
-                      <a:ext cx="5731510" cy="2362835"/>
+                      <a:ext cx="5700896" cy="2362835"/>
                     </a:xfrm>
                     <a:prstGeom prst="rect">
                       <a:avLst/>
@@ -3686,41 +3729,40 @@
         <w:jc w:val="both"/>
         <w:rPr>
           <w:rFonts w:ascii="Times New Roman" w:hAnsi="Times New Roman" w:cs="Times New Roman"/>
-        </w:rPr>
-      </w:pPr>
-    </w:p>
-    <w:p>
-      <w:pPr>
-        <w:spacing w:line="360" w:lineRule="auto"/>
-        <w:jc w:val="both"/>
-        <w:rPr>
-          <w:rFonts w:ascii="Times New Roman" w:hAnsi="Times New Roman" w:cs="Times New Roman"/>
-          <w:b/>
-          <w:bCs/>
-        </w:rPr>
-      </w:pPr>
-      <w:r>
-        <w:rPr>
-          <w:rFonts w:ascii="Times New Roman" w:hAnsi="Times New Roman" w:cs="Times New Roman"/>
-          <w:b/>
-          <w:bCs/>
-        </w:rPr>
-        <w:t>6. CONCLUSION</w:t>
-      </w:r>
-    </w:p>
-    <w:p>
-      <w:pPr>
-        <w:spacing w:line="360" w:lineRule="auto"/>
-        <w:jc w:val="both"/>
-        <w:rPr>
-          <w:rFonts w:ascii="Times New Roman" w:hAnsi="Times New Roman" w:cs="Times New Roman"/>
-        </w:rPr>
-      </w:pPr>
-      <w:r>
-        <w:rPr>
-          <w:rFonts w:ascii="Times New Roman" w:hAnsi="Times New Roman" w:cs="Times New Roman"/>
-        </w:rPr>
-        <w:t xml:space="preserve">A complete digital forensics acquisition and analysis workflow was successfully executed via a combination of GUI and CLI tools. The target physical USB drive was securely imaged and verified using FTK Imager. Simultaneously, the system's live RAM was extracted via the Command Prompt using </w:t>
+          <w:b/>
+          <w:bCs/>
+        </w:rPr>
+      </w:pPr>
+      <w:r>
+        <w:rPr>
+          <w:rFonts w:ascii="Times New Roman" w:hAnsi="Times New Roman" w:cs="Times New Roman"/>
+          <w:b/>
+          <w:bCs/>
+        </w:rPr>
+        <w:t xml:space="preserve">6. </w:t>
+      </w:r>
+      <w:r>
+        <w:rPr>
+          <w:rFonts w:ascii="Times New Roman" w:hAnsi="Times New Roman" w:cs="Times New Roman"/>
+          <w:b/>
+          <w:bCs/>
+        </w:rPr>
+        <w:t>RESULT</w:t>
+      </w:r>
+    </w:p>
+    <w:p>
+      <w:pPr>
+        <w:spacing w:line="360" w:lineRule="auto"/>
+        <w:jc w:val="both"/>
+        <w:rPr>
+          <w:rFonts w:ascii="Times New Roman" w:hAnsi="Times New Roman" w:cs="Times New Roman"/>
+        </w:rPr>
+      </w:pPr>
+      <w:r>
+        <w:rPr>
+          <w:rFonts w:ascii="Times New Roman" w:hAnsi="Times New Roman" w:cs="Times New Roman"/>
+        </w:rPr>
+        <w:t xml:space="preserve">The digital evidence acquisition and analysis process was successfully completed. The physical USB storage device was acquired as a Raw (dd) image using FTK Imager, and its integrity was verified using MD5 and SHA1 hash values. Volatile memory was successfully captured using </w:t>
       </w:r>
       <w:proofErr w:type="spellStart"/>
       <w:r>
@@ -3734,17 +3776,36 @@
         <w:rPr>
           <w:rFonts w:ascii="Times New Roman" w:hAnsi="Times New Roman" w:cs="Times New Roman"/>
         </w:rPr>
-        <w:t>. Finally, Volatility 3 command-line syntax was utilized to parse the raw memory file, successfully recovering critical live-state artifacts, including the process list and execution timestamps.</w:t>
-      </w:r>
-    </w:p>
-    <w:p>
-      <w:pPr>
-        <w:spacing w:line="360" w:lineRule="auto"/>
-        <w:jc w:val="both"/>
-        <w:rPr>
-          <w:rFonts w:ascii="Times New Roman" w:hAnsi="Times New Roman" w:cs="Times New Roman"/>
-        </w:rPr>
-      </w:pPr>
+        <w:t xml:space="preserve"> through the Command Prompt and saved as </w:t>
+      </w:r>
+      <w:proofErr w:type="gramStart"/>
+      <w:r>
+        <w:rPr>
+          <w:rFonts w:ascii="Times New Roman" w:hAnsi="Times New Roman" w:cs="Times New Roman"/>
+        </w:rPr>
+        <w:t>a .raw</w:t>
+      </w:r>
+      <w:proofErr w:type="gramEnd"/>
+      <w:r>
+        <w:rPr>
+          <w:rFonts w:ascii="Times New Roman" w:hAnsi="Times New Roman" w:cs="Times New Roman"/>
+        </w:rPr>
+        <w:t xml:space="preserve"> memory dump. The captured memory image was successfully loaded and </w:t>
+      </w:r>
+      <w:proofErr w:type="spellStart"/>
+      <w:r>
+        <w:rPr>
+          <w:rFonts w:ascii="Times New Roman" w:hAnsi="Times New Roman" w:cs="Times New Roman"/>
+        </w:rPr>
+        <w:t>analyzed</w:t>
+      </w:r>
+      <w:proofErr w:type="spellEnd"/>
+      <w:r>
+        <w:rPr>
+          <w:rFonts w:ascii="Times New Roman" w:hAnsi="Times New Roman" w:cs="Times New Roman"/>
+        </w:rPr>
+        <w:t xml:space="preserve"> using Volatility 3, which extracted the active process information, including PID, PPID, process names, and timestamps. Thus, the required disk imaging, RAM acquisition, hash verification, and memory analysis were successfully performed.</w:t>
+      </w:r>
     </w:p>
     <w:sectPr>
       <w:pgSz w:w="11906" w:h="16838"/>
@@ -4972,7 +5033,6 @@
   <w:style w:type="character" w:default="1" w:styleId="DefaultParagraphFont">
     <w:name w:val="Default Paragraph Font"/>
     <w:uiPriority w:val="1"/>
-    <w:semiHidden/>
     <w:unhideWhenUsed/>
   </w:style>
   <w:style w:type="table" w:default="1" w:styleId="TableNormal">

</xml_diff>